<commit_message>
feat: complete submission package tailored for Elsevier Neural Networks (NEUNET)
</commit_message>
<xml_diff>
--- a/submission_package/01_Cover_Letter.docx
+++ b/submission_package/01_Cover_Letter.docx
@@ -27,9 +27,11 @@
         </w:rPr>
         <w:t>To:</w:t>
         <w:br/>
-        <w:t>The Editor-in-Chief,</w:t>
+        <w:t>The Editors-in-Chief,</w:t>
         <w:br/>
-        <w:t>Journal Submission Office</w:t>
+        <w:t>Neural Networks (Elsevier)</w:t>
+        <w:br/>
+        <w:t>Official Journal of the International Neural Network Society (INNS), ENNS, &amp; JNNS</w:t>
       </w:r>
     </w:p>
     <w:p>
@@ -43,7 +45,7 @@
           <w:b/>
           <w:sz w:val="23"/>
         </w:rPr>
-        <w:t>Dear Editor-in-Chief,</w:t>
+        <w:t>Dear Editors-in-Chief,</w:t>
         <w:br/>
         <w:br/>
       </w:r>
@@ -65,7 +67,7 @@
           <w:rFonts w:ascii="Times New Roman" w:hAnsi="Times New Roman"/>
           <w:sz w:val="23"/>
         </w:rPr>
-        <w:t>We are pleased to submit our original research article titled "Contractive Latent Dynamical Reasoning: Bypassing Autoregressive Rollouts via Operator-Norm Contraction" for consideration for publication in your prestigious journal.</w:t>
+        <w:t>We are pleased to submit our original research article titled "Contractive Latent Dynamical Reasoning: Bypassing Autoregressive Rollouts via Operator-Norm Contraction" for consideration for publication as a Regular Paper in Neural Networks.</w:t>
       </w:r>
     </w:p>
     <w:p>
@@ -78,7 +80,7 @@
           <w:rFonts w:ascii="Times New Roman" w:hAnsi="Times New Roman"/>
           <w:sz w:val="23"/>
         </w:rPr>
-        <w:t>This work addresses a primary bottleneck in modern reasoning architectures: the error compounding, quadratic memory overhead, and runaway drift inherent to discrete autoregressive Chain-of-Thought (CoT) token generation. We introduce Contractive Latent Dynamical Reasoning (CLR), a continuous-time framework that formulates multi-step reasoning as an algebraically constrained dynamical system evolving in continuous latent space. By establishing strict Demidovich contraction (</w:t>
+        <w:t>Why this work is ideally suited for Neural Networks: Neural Networks has long served as the premier venue for foundational breakthroughs bridging non-linear dynamical systems, neurocomputing, and recurrent architectures. Our paper tackles a defining challenge in frontier AI: the compounding error drift, quadratic context overhead, and unconstrained hallucinations inherent to discrete autoregressive Chain-of-Thought (CoT) token rollouts. We formulate multi-step reasoning as a continuous-time dynamical system evolving on a latent manifold under strict Demidovich contraction (</w:t>
       </w:r>
       <m:oMath>
         <m:box>
@@ -179,7 +181,7 @@
           <w:rFonts w:ascii="Times New Roman" w:hAnsi="Times New Roman"/>
           <w:sz w:val="23"/>
         </w:rPr>
-        <w:t>), CLR mathematically guarantees exponential convergence to a unique problem-conditioned equilibrium.</w:t>
+        <w:t>). This guarantees exponential convergence to a unique problem-conditioned equilibrium, enabling smooth continuous test-time scaling.</w:t>
       </w:r>
     </w:p>
     <w:p>
@@ -205,7 +207,7 @@
           <w:rFonts w:ascii="Times New Roman" w:hAnsi="Times New Roman"/>
           <w:sz w:val="23"/>
         </w:rPr>
-        <w:t>1. Formal Expressivity Boundary: We prove why damped Input-Convex Neural Network (ICNN) potential flows fail on non-convex combinatorial parity (verifying our pre-registered kill criterion at chance), and demonstrate how spectrally normalized non-potential flows resolve this tension.</w:t>
+        <w:t>1. Formal Expressivity Boundary: We prove why damped Input-Convex Neural Network (ICNN) potential flows fail on non-convex combinatorial parity (verifying our pre-registered kill criterion at chance), and demonstrate how spectrally bounded non-potential flows resolve this expressivity-contraction trade-off.</w:t>
       </w:r>
     </w:p>
     <w:p>
@@ -372,7 +374,7 @@
           <w:rFonts w:ascii="Times New Roman" w:hAnsi="Times New Roman"/>
           <w:sz w:val="23"/>
         </w:rPr>
-        <w:t>3. Physical Refutation of Self-Healing: Under a unified numerical harness, we refute naive claims of 'self-healing' under global additive noise on graphs, revealing the exact log-norm energy floor mechanism responsible for threshold crossing.</w:t>
+        <w:t>3. Physical Refutation of Self-Healing: Under a unified numerical integration harness, we refute naive claims of 'self-healing' under global additive noise on graphs, revealing the exact log-norm energy floor mechanism responsible for threshold crossing.</w:t>
       </w:r>
     </w:p>
     <w:p>
@@ -385,7 +387,7 @@
           <w:rFonts w:ascii="Times New Roman" w:hAnsi="Times New Roman"/>
           <w:sz w:val="23"/>
         </w:rPr>
-        <w:t>4. Large-Scale Numerical Verification: We design an autograd-based shifted power iteration that verifies Demidovich contraction across all 43,328 dimensions in 0.22 seconds.</w:t>
+        <w:t>4. Large-Scale Numerical Verification: We introduce an autograd-based shifted power iteration that verifies Demidovich contraction across all 43,328 dimensions in 0.22 seconds.</w:t>
       </w:r>
     </w:p>
     <w:p>
@@ -398,7 +400,7 @@
           <w:rFonts w:ascii="Times New Roman" w:hAnsi="Times New Roman"/>
           <w:sz w:val="23"/>
         </w:rPr>
-        <w:t>This manuscript represents original work and is not currently under consideration for publication elsewhere. All authors (Dipesh Gurung, Binod Bhattarai, and Dr. R N Thakur) have read, contributed to, and approved the final submitted version. The complete submission package comprises the Cover Letter, Title Page, Highlights, Full Manuscript, and comprehensive Supplementary Material document detailing mathematical proofs, the 43,328-dimension shifted power iteration algorithm, complete hyperparameter configurations, and zero-leakage dataset protocols. Source code, test suites (24 passed unit tests), and model checkpoints are publicly available at: https://github.com/Dips7/contractive-latent-reasoning.</w:t>
+        <w:t>This manuscript represents original work and is not currently under consideration for publication elsewhere. All authors (Dipesh Gurung, Binod Bhattarai, and Dr. R N Thakur) have read, contributed to, and approved the submitted version. The complete submission package comprises the Cover Letter, Title Page, Highlights (strictly &lt;= 85 characters per bullet), Full Manuscript (with continuous line numbering), Standalone Supplementary Material, Declaration of Competing Interests, and CRediT Author Statement. Complete source code, test suites (24 passed unit tests), and model checkpoints are publicly available at: https://github.com/Dips7/contractive-latent-reasoning.</w:t>
       </w:r>
     </w:p>
     <w:p>
@@ -411,7 +413,7 @@
           <w:rFonts w:ascii="Times New Roman" w:hAnsi="Times New Roman"/>
           <w:sz w:val="23"/>
         </w:rPr>
-        <w:t>Thank you very much for your time, consideration, and handling of our manuscript. We look forward to hearing from you.</w:t>
+        <w:t>Thank you very much for your time, consideration, and handling of our manuscript. We look forward to the peer review process.</w:t>
       </w:r>
     </w:p>
     <w:p>

</xml_diff>

<commit_message>
docs(metadata): synchronize author details, affiliations, and ORCIDs across manuscript and submission package
</commit_message>
<xml_diff>
--- a/submission_package/01_Cover_Letter.docx
+++ b/submission_package/01_Cover_Letter.docx
@@ -400,7 +400,7 @@
           <w:rFonts w:ascii="Times New Roman" w:hAnsi="Times New Roman"/>
           <w:sz w:val="23"/>
         </w:rPr>
-        <w:t>This manuscript represents original work and is not currently under consideration for publication elsewhere. All authors (Dipesh Gurung, Binod Bhattarai, and Dr. R N Thakur) have read, contributed to, and approved the submitted version. The complete submission package comprises the Cover Letter, Title Page, Highlights (strictly &lt;= 85 characters per bullet), Full Manuscript (with continuous line numbering), Standalone Supplementary Material, Declaration of Competing Interests, and CRediT Author Statement. Complete source code, test suites (24 passed unit tests), and model checkpoints are publicly available at: https://github.com/Dips7/contractive-latent-reasoning.</w:t>
+        <w:t>This manuscript represents original work and is not currently under consideration for publication elsewhere. All authors (Dipesh Gurung, Binod Bhattarai, and Prof. Dr. R.N. Thakur) have read, contributed to, and approved the submitted version. The complete submission package comprises the Cover Letter, Title Page, Highlights (strictly &lt;= 85 characters per bullet), Full Manuscript (with continuous line numbering), Standalone Supplementary Material, Declaration of Competing Interests, and CRediT Author Statement. Complete source code, test suites (24 passed unit tests), and model checkpoints are publicly available at: https://github.com/Dips7/contractive-latent-reasoning.</w:t>
       </w:r>
     </w:p>
     <w:p>
@@ -429,13 +429,15 @@
         <w:t>Sincerely,</w:t>
         <w:br/>
         <w:br/>
-        <w:t>Dipesh Gurung (Corresponding Author)</w:t>
+        <w:t>Dipesh Gurung, M.Sc. (Corresponding Author)</w:t>
         <w:br/>
-        <w:t>Department of Information Technology</w:t>
+        <w:t>Research Associate, Research Department</w:t>
         <w:br/>
-        <w:t>Lord Buddha Education Foundation, Kathmandu 44600, Nepal</w:t>
+        <w:t>Lord Buddha Education Foundation (LBEF Campus)</w:t>
         <w:br/>
-        <w:t>Email: dipesh.gurung@lbef.edu.np | Tel: +977-1-4424412</w:t>
+        <w:t>Opposite to Maitidevi Temple, Kathmandu 44600, Nepal</w:t>
+        <w:br/>
+        <w:t>Email: dipesh.gurung@lbef.edu.np (Primary) / dips.grg7@gmail.com | Tel: +977-1-4424412</w:t>
         <w:br/>
         <w:t>ORCID: 0009-0009-0335-2267</w:t>
       </w:r>

</xml_diff>